<commit_message>
Remove legacy sponsors pages and apply Phase 1–2 cleanup.
Redirect sponsors.html to sponsorship_partnership, sync routes/sitemap/search, point home and donate CTAs correctly, standardize EN footer chair name to Messoud Efendiyev, and trim sponsors JS plus dead donate CSS.

Co-authored-by: Cursor <cursoragent@cursor.com>
</commit_message>
<xml_diff>
--- a/documents/docx/DAAB-Website-Linguistic-Consistency-Audit.docx
+++ b/documents/docx/DAAB-Website-Linguistic-Consistency-Audit.docx
@@ -95,12 +95,12 @@
     </w:p>
     <w:p>
       <w:r>
-        <w:t>This report documents linguistic, terminological, and UI consistency findings across the bilingual DAAB (Azerbaijani) and WAAS (English) static website. A total of 11 distinct issues were recorded after automated extraction and editorial review of 62 HTML page paths. No corrections have been applied to the repository; this document is intended for review and approval before implementation.</w:t>
+        <w:t>This report documents linguistic, terminological, and UI consistency findings across the bilingual DAAB (Azerbaijani) and WAAS (English) static website. A total of 2 distinct issues were recorded after automated extraction and editorial review of 60 HTML page paths. No corrections have been applied to the repository; this document is intended for review and approval before implementation.</w:t>
       </w:r>
     </w:p>
     <w:p>
       <w:r>
-        <w:t>Breakdown: Azerbaijani — 5 findings; English — 6 findings; Cross-locale / structure — 0 findings; Global (i18n / sitewide) — 2 findings.</w:t>
+        <w:t>Breakdown: Azerbaijani — 1 findings; English — 1 findings; Cross-locale / structure — 0 findings; Global (i18n / sitewide) — 2 findings.</w:t>
       </w:r>
     </w:p>
     <w:p>
@@ -813,788 +813,6 @@
     </w:tbl>
     <w:p/>
     <w:p>
-      <w:pPr>
-        <w:pStyle w:val="Heading2"/>
-      </w:pPr>
-      <w:r>
-        <w:t>az/application.html</w:t>
-      </w:r>
-    </w:p>
-    <w:p>
-      <w:r>
-        <w:t>Findings: 2</w:t>
-      </w:r>
-    </w:p>
-    <w:tbl>
-      <w:tblPr>
-        <w:tblStyle w:val="TableGrid"/>
-        <w:tblW w:type="auto" w:w="0"/>
-        <w:jc w:val="center"/>
-        <w:tblLook w:firstColumn="1" w:firstRow="1" w:lastColumn="0" w:lastRow="0" w:noHBand="0" w:noVBand="1" w:val="04A0"/>
-      </w:tblPr>
-      <w:tblGrid>
-        <w:gridCol w:w="1662"/>
-        <w:gridCol w:w="1662"/>
-        <w:gridCol w:w="1662"/>
-        <w:gridCol w:w="1662"/>
-        <w:gridCol w:w="1662"/>
-        <w:gridCol w:w="1662"/>
-      </w:tblGrid>
-      <w:tr>
-        <w:tc>
-          <w:tcPr>
-            <w:tcW w:type="dxa" w:w="1662"/>
-            <w:shd w:fill="094D78" w:val="clear"/>
-          </w:tcPr>
-          <w:p>
-            <w:r/>
-            <w:r>
-              <w:rPr>
-                <w:b/>
-                <w:color w:val="FFFFFF"/>
-                <w:sz w:val="18"/>
-              </w:rPr>
-              <w:t>#</w:t>
-            </w:r>
-          </w:p>
-        </w:tc>
-        <w:tc>
-          <w:tcPr>
-            <w:tcW w:type="dxa" w:w="1662"/>
-            <w:shd w:fill="094D78" w:val="clear"/>
-          </w:tcPr>
-          <w:p>
-            <w:r/>
-            <w:r>
-              <w:rPr>
-                <w:b/>
-                <w:color w:val="FFFFFF"/>
-                <w:sz w:val="18"/>
-              </w:rPr>
-              <w:t>Location</w:t>
-            </w:r>
-          </w:p>
-        </w:tc>
-        <w:tc>
-          <w:tcPr>
-            <w:tcW w:type="dxa" w:w="1662"/>
-            <w:shd w:fill="094D78" w:val="clear"/>
-          </w:tcPr>
-          <w:p>
-            <w:r/>
-            <w:r>
-              <w:rPr>
-                <w:b/>
-                <w:color w:val="FFFFFF"/>
-                <w:sz w:val="18"/>
-              </w:rPr>
-              <w:t>Original text</w:t>
-            </w:r>
-          </w:p>
-        </w:tc>
-        <w:tc>
-          <w:tcPr>
-            <w:tcW w:type="dxa" w:w="1662"/>
-            <w:shd w:fill="094D78" w:val="clear"/>
-          </w:tcPr>
-          <w:p>
-            <w:r/>
-            <w:r>
-              <w:rPr>
-                <w:b/>
-                <w:color w:val="FFFFFF"/>
-                <w:sz w:val="18"/>
-              </w:rPr>
-              <w:t>Recommended correction</w:t>
-            </w:r>
-          </w:p>
-        </w:tc>
-        <w:tc>
-          <w:tcPr>
-            <w:tcW w:type="dxa" w:w="1662"/>
-            <w:shd w:fill="094D78" w:val="clear"/>
-          </w:tcPr>
-          <w:p>
-            <w:r/>
-            <w:r>
-              <w:rPr>
-                <w:b/>
-                <w:color w:val="FFFFFF"/>
-                <w:sz w:val="18"/>
-              </w:rPr>
-              <w:t>Category</w:t>
-            </w:r>
-          </w:p>
-        </w:tc>
-        <w:tc>
-          <w:tcPr>
-            <w:tcW w:type="dxa" w:w="1662"/>
-            <w:shd w:fill="094D78" w:val="clear"/>
-          </w:tcPr>
-          <w:p>
-            <w:r/>
-            <w:r>
-              <w:rPr>
-                <w:b/>
-                <w:color w:val="FFFFFF"/>
-                <w:sz w:val="18"/>
-              </w:rPr>
-              <w:t>Comments</w:t>
-            </w:r>
-          </w:p>
-        </w:tc>
-      </w:tr>
-      <w:tr>
-        <w:tc>
-          <w:tcPr>
-            <w:tcW w:type="dxa" w:w="1662"/>
-            <w:shd w:fill="F4F7FA" w:val="clear"/>
-          </w:tcPr>
-          <w:p>
-            <w:r/>
-            <w:r>
-              <w:rPr>
-                <w:b w:val="0"/>
-                <w:sz w:val="16"/>
-              </w:rPr>
-              <w:t>2</w:t>
-            </w:r>
-          </w:p>
-        </w:tc>
-        <w:tc>
-          <w:tcPr>
-            <w:tcW w:type="dxa" w:w="1662"/>
-            <w:shd w:fill="F4F7FA" w:val="clear"/>
-          </w:tcPr>
-          <w:p>
-            <w:r/>
-            <w:r>
-              <w:rPr>
-                <w:b w:val="0"/>
-                <w:sz w:val="16"/>
-              </w:rPr>
-              <w:t>Field gloss (English)</w:t>
-            </w:r>
-          </w:p>
-        </w:tc>
-        <w:tc>
-          <w:tcPr>
-            <w:tcW w:type="dxa" w:w="1662"/>
-            <w:shd w:fill="F4F7FA" w:val="clear"/>
-          </w:tcPr>
-          <w:p>
-            <w:r/>
-            <w:r>
-              <w:rPr>
-                <w:b w:val="0"/>
-                <w:sz w:val="16"/>
-              </w:rPr>
-              <w:t>Contributions you can make to the activities of WAAS</w:t>
-            </w:r>
-          </w:p>
-        </w:tc>
-        <w:tc>
-          <w:tcPr>
-            <w:tcW w:type="dxa" w:w="1662"/>
-            <w:shd w:fill="F4F7FA" w:val="clear"/>
-          </w:tcPr>
-          <w:p>
-            <w:r/>
-            <w:r>
-              <w:rPr>
-                <w:b w:val="0"/>
-                <w:sz w:val="16"/>
-              </w:rPr>
-              <w:t>…DAAB… (or remove English gloss on AZ page)</w:t>
-            </w:r>
-          </w:p>
-        </w:tc>
-        <w:tc>
-          <w:tcPr>
-            <w:tcW w:type="dxa" w:w="1662"/>
-            <w:shd w:fill="F4F7FA" w:val="clear"/>
-          </w:tcPr>
-          <w:p>
-            <w:r/>
-            <w:r>
-              <w:rPr>
-                <w:b w:val="0"/>
-                <w:sz w:val="16"/>
-              </w:rPr>
-              <w:t>Mixed language</w:t>
-            </w:r>
-          </w:p>
-        </w:tc>
-        <w:tc>
-          <w:tcPr>
-            <w:tcW w:type="dxa" w:w="1662"/>
-            <w:shd w:fill="F4F7FA" w:val="clear"/>
-          </w:tcPr>
-          <w:p>
-            <w:r/>
-            <w:r>
-              <w:rPr>
-                <w:b w:val="0"/>
-                <w:sz w:val="16"/>
-              </w:rPr>
-              <w:t>Wrong acronym and unnecessary English on AZ-only form.</w:t>
-            </w:r>
-          </w:p>
-        </w:tc>
-      </w:tr>
-      <w:tr>
-        <w:tc>
-          <w:tcPr>
-            <w:tcW w:type="dxa" w:w="1662"/>
-          </w:tcPr>
-          <w:p>
-            <w:r/>
-            <w:r>
-              <w:rPr>
-                <w:b w:val="0"/>
-                <w:sz w:val="16"/>
-              </w:rPr>
-              <w:t>3</w:t>
-            </w:r>
-          </w:p>
-        </w:tc>
-        <w:tc>
-          <w:tcPr>
-            <w:tcW w:type="dxa" w:w="1662"/>
-          </w:tcPr>
-          <w:p>
-            <w:r/>
-            <w:r>
-              <w:rPr>
-                <w:b w:val="0"/>
-                <w:sz w:val="16"/>
-              </w:rPr>
-              <w:t>Academic rank label</w:t>
-            </w:r>
-          </w:p>
-        </w:tc>
-        <w:tc>
-          <w:tcPr>
-            <w:tcW w:type="dxa" w:w="1662"/>
-          </w:tcPr>
-          <w:p>
-            <w:r/>
-            <w:r>
-              <w:rPr>
-                <w:b w:val="0"/>
-                <w:sz w:val="16"/>
-              </w:rPr>
-              <w:t>Akademik rütbəniz</w:t>
-            </w:r>
-          </w:p>
-        </w:tc>
-        <w:tc>
-          <w:tcPr>
-            <w:tcW w:type="dxa" w:w="1662"/>
-          </w:tcPr>
-          <w:p>
-            <w:r/>
-            <w:r>
-              <w:rPr>
-                <w:b w:val="0"/>
-                <w:sz w:val="16"/>
-              </w:rPr>
-              <w:t>Akademik adınız / Akademik titulunuz</w:t>
-            </w:r>
-          </w:p>
-        </w:tc>
-        <w:tc>
-          <w:tcPr>
-            <w:tcW w:type="dxa" w:w="1662"/>
-          </w:tcPr>
-          <w:p>
-            <w:r/>
-            <w:r>
-              <w:rPr>
-                <w:b w:val="0"/>
-                <w:sz w:val="16"/>
-              </w:rPr>
-              <w:t>Terminology</w:t>
-            </w:r>
-          </w:p>
-        </w:tc>
-        <w:tc>
-          <w:tcPr>
-            <w:tcW w:type="dxa" w:w="1662"/>
-          </w:tcPr>
-          <w:p>
-            <w:r/>
-            <w:r>
-              <w:rPr>
-                <w:b w:val="0"/>
-                <w:sz w:val="16"/>
-              </w:rPr>
-              <w:t>rütbə often implies military rank; EN uses Academic Title.</w:t>
-            </w:r>
-          </w:p>
-        </w:tc>
-      </w:tr>
-    </w:tbl>
-    <w:p/>
-    <w:p>
-      <w:pPr>
-        <w:pStyle w:val="Heading2"/>
-      </w:pPr>
-      <w:r>
-        <w:t>az/index.html</w:t>
-      </w:r>
-    </w:p>
-    <w:p>
-      <w:r>
-        <w:t>Findings: 1</w:t>
-      </w:r>
-    </w:p>
-    <w:tbl>
-      <w:tblPr>
-        <w:tblStyle w:val="TableGrid"/>
-        <w:tblW w:type="auto" w:w="0"/>
-        <w:jc w:val="center"/>
-        <w:tblLook w:firstColumn="1" w:firstRow="1" w:lastColumn="0" w:lastRow="0" w:noHBand="0" w:noVBand="1" w:val="04A0"/>
-      </w:tblPr>
-      <w:tblGrid>
-        <w:gridCol w:w="1662"/>
-        <w:gridCol w:w="1662"/>
-        <w:gridCol w:w="1662"/>
-        <w:gridCol w:w="1662"/>
-        <w:gridCol w:w="1662"/>
-        <w:gridCol w:w="1662"/>
-      </w:tblGrid>
-      <w:tr>
-        <w:tc>
-          <w:tcPr>
-            <w:tcW w:type="dxa" w:w="1662"/>
-            <w:shd w:fill="094D78" w:val="clear"/>
-          </w:tcPr>
-          <w:p>
-            <w:r/>
-            <w:r>
-              <w:rPr>
-                <w:b/>
-                <w:color w:val="FFFFFF"/>
-                <w:sz w:val="18"/>
-              </w:rPr>
-              <w:t>#</w:t>
-            </w:r>
-          </w:p>
-        </w:tc>
-        <w:tc>
-          <w:tcPr>
-            <w:tcW w:type="dxa" w:w="1662"/>
-            <w:shd w:fill="094D78" w:val="clear"/>
-          </w:tcPr>
-          <w:p>
-            <w:r/>
-            <w:r>
-              <w:rPr>
-                <w:b/>
-                <w:color w:val="FFFFFF"/>
-                <w:sz w:val="18"/>
-              </w:rPr>
-              <w:t>Location</w:t>
-            </w:r>
-          </w:p>
-        </w:tc>
-        <w:tc>
-          <w:tcPr>
-            <w:tcW w:type="dxa" w:w="1662"/>
-            <w:shd w:fill="094D78" w:val="clear"/>
-          </w:tcPr>
-          <w:p>
-            <w:r/>
-            <w:r>
-              <w:rPr>
-                <w:b/>
-                <w:color w:val="FFFFFF"/>
-                <w:sz w:val="18"/>
-              </w:rPr>
-              <w:t>Original text</w:t>
-            </w:r>
-          </w:p>
-        </w:tc>
-        <w:tc>
-          <w:tcPr>
-            <w:tcW w:type="dxa" w:w="1662"/>
-            <w:shd w:fill="094D78" w:val="clear"/>
-          </w:tcPr>
-          <w:p>
-            <w:r/>
-            <w:r>
-              <w:rPr>
-                <w:b/>
-                <w:color w:val="FFFFFF"/>
-                <w:sz w:val="18"/>
-              </w:rPr>
-              <w:t>Recommended correction</w:t>
-            </w:r>
-          </w:p>
-        </w:tc>
-        <w:tc>
-          <w:tcPr>
-            <w:tcW w:type="dxa" w:w="1662"/>
-            <w:shd w:fill="094D78" w:val="clear"/>
-          </w:tcPr>
-          <w:p>
-            <w:r/>
-            <w:r>
-              <w:rPr>
-                <w:b/>
-                <w:color w:val="FFFFFF"/>
-                <w:sz w:val="18"/>
-              </w:rPr>
-              <w:t>Category</w:t>
-            </w:r>
-          </w:p>
-        </w:tc>
-        <w:tc>
-          <w:tcPr>
-            <w:tcW w:type="dxa" w:w="1662"/>
-            <w:shd w:fill="094D78" w:val="clear"/>
-          </w:tcPr>
-          <w:p>
-            <w:r/>
-            <w:r>
-              <w:rPr>
-                <w:b/>
-                <w:color w:val="FFFFFF"/>
-                <w:sz w:val="18"/>
-              </w:rPr>
-              <w:t>Comments</w:t>
-            </w:r>
-          </w:p>
-        </w:tc>
-      </w:tr>
-      <w:tr>
-        <w:tc>
-          <w:tcPr>
-            <w:tcW w:type="dxa" w:w="1662"/>
-            <w:shd w:fill="F4F7FA" w:val="clear"/>
-          </w:tcPr>
-          <w:p>
-            <w:r/>
-            <w:r>
-              <w:rPr>
-                <w:b w:val="0"/>
-                <w:sz w:val="16"/>
-              </w:rPr>
-              <w:t>4</w:t>
-            </w:r>
-          </w:p>
-        </w:tc>
-        <w:tc>
-          <w:tcPr>
-            <w:tcW w:type="dxa" w:w="1662"/>
-            <w:shd w:fill="F4F7FA" w:val="clear"/>
-          </w:tcPr>
-          <w:p>
-            <w:r/>
-            <w:r>
-              <w:rPr>
-                <w:b w:val="0"/>
-                <w:sz w:val="16"/>
-              </w:rPr>
-              <w:t>Homepage card tag</w:t>
-            </w:r>
-          </w:p>
-        </w:tc>
-        <w:tc>
-          <w:tcPr>
-            <w:tcW w:type="dxa" w:w="1662"/>
-            <w:shd w:fill="F4F7FA" w:val="clear"/>
-          </w:tcPr>
-          <w:p>
-            <w:r/>
-            <w:r>
-              <w:rPr>
-                <w:b w:val="0"/>
-                <w:sz w:val="16"/>
-              </w:rPr>
-              <w:t>Təsisat</w:t>
-            </w:r>
-          </w:p>
-        </w:tc>
-        <w:tc>
-          <w:tcPr>
-            <w:tcW w:type="dxa" w:w="1662"/>
-            <w:shd w:fill="F4F7FA" w:val="clear"/>
-          </w:tcPr>
-          <w:p>
-            <w:r/>
-            <w:r>
-              <w:rPr>
-                <w:b w:val="0"/>
-                <w:sz w:val="16"/>
-              </w:rPr>
-              <w:t>Təsis</w:t>
-            </w:r>
-          </w:p>
-        </w:tc>
-        <w:tc>
-          <w:tcPr>
-            <w:tcW w:type="dxa" w:w="1662"/>
-            <w:shd w:fill="F4F7FA" w:val="clear"/>
-          </w:tcPr>
-          <w:p>
-            <w:r/>
-            <w:r>
-              <w:rPr>
-                <w:b w:val="0"/>
-                <w:sz w:val="16"/>
-              </w:rPr>
-              <w:t>Terminology</w:t>
-            </w:r>
-          </w:p>
-        </w:tc>
-        <w:tc>
-          <w:tcPr>
-            <w:tcW w:type="dxa" w:w="1662"/>
-            <w:shd w:fill="F4F7FA" w:val="clear"/>
-          </w:tcPr>
-          <w:p>
-            <w:r/>
-            <w:r>
-              <w:rPr>
-                <w:b w:val="0"/>
-                <w:sz w:val="16"/>
-              </w:rPr>
-              <w:t>Təsisat usually means facilities/installations; EN tag is Foundation.</w:t>
-            </w:r>
-          </w:p>
-        </w:tc>
-      </w:tr>
-    </w:tbl>
-    <w:p/>
-    <w:p>
-      <w:pPr>
-        <w:pStyle w:val="Heading2"/>
-      </w:pPr>
-      <w:r>
-        <w:t>az/membership.html</w:t>
-      </w:r>
-    </w:p>
-    <w:p>
-      <w:r>
-        <w:t>Findings: 1</w:t>
-      </w:r>
-    </w:p>
-    <w:tbl>
-      <w:tblPr>
-        <w:tblStyle w:val="TableGrid"/>
-        <w:tblW w:type="auto" w:w="0"/>
-        <w:jc w:val="center"/>
-        <w:tblLook w:firstColumn="1" w:firstRow="1" w:lastColumn="0" w:lastRow="0" w:noHBand="0" w:noVBand="1" w:val="04A0"/>
-      </w:tblPr>
-      <w:tblGrid>
-        <w:gridCol w:w="1662"/>
-        <w:gridCol w:w="1662"/>
-        <w:gridCol w:w="1662"/>
-        <w:gridCol w:w="1662"/>
-        <w:gridCol w:w="1662"/>
-        <w:gridCol w:w="1662"/>
-      </w:tblGrid>
-      <w:tr>
-        <w:tc>
-          <w:tcPr>
-            <w:tcW w:type="dxa" w:w="1662"/>
-            <w:shd w:fill="094D78" w:val="clear"/>
-          </w:tcPr>
-          <w:p>
-            <w:r/>
-            <w:r>
-              <w:rPr>
-                <w:b/>
-                <w:color w:val="FFFFFF"/>
-                <w:sz w:val="18"/>
-              </w:rPr>
-              <w:t>#</w:t>
-            </w:r>
-          </w:p>
-        </w:tc>
-        <w:tc>
-          <w:tcPr>
-            <w:tcW w:type="dxa" w:w="1662"/>
-            <w:shd w:fill="094D78" w:val="clear"/>
-          </w:tcPr>
-          <w:p>
-            <w:r/>
-            <w:r>
-              <w:rPr>
-                <w:b/>
-                <w:color w:val="FFFFFF"/>
-                <w:sz w:val="18"/>
-              </w:rPr>
-              <w:t>Location</w:t>
-            </w:r>
-          </w:p>
-        </w:tc>
-        <w:tc>
-          <w:tcPr>
-            <w:tcW w:type="dxa" w:w="1662"/>
-            <w:shd w:fill="094D78" w:val="clear"/>
-          </w:tcPr>
-          <w:p>
-            <w:r/>
-            <w:r>
-              <w:rPr>
-                <w:b/>
-                <w:color w:val="FFFFFF"/>
-                <w:sz w:val="18"/>
-              </w:rPr>
-              <w:t>Original text</w:t>
-            </w:r>
-          </w:p>
-        </w:tc>
-        <w:tc>
-          <w:tcPr>
-            <w:tcW w:type="dxa" w:w="1662"/>
-            <w:shd w:fill="094D78" w:val="clear"/>
-          </w:tcPr>
-          <w:p>
-            <w:r/>
-            <w:r>
-              <w:rPr>
-                <w:b/>
-                <w:color w:val="FFFFFF"/>
-                <w:sz w:val="18"/>
-              </w:rPr>
-              <w:t>Recommended correction</w:t>
-            </w:r>
-          </w:p>
-        </w:tc>
-        <w:tc>
-          <w:tcPr>
-            <w:tcW w:type="dxa" w:w="1662"/>
-            <w:shd w:fill="094D78" w:val="clear"/>
-          </w:tcPr>
-          <w:p>
-            <w:r/>
-            <w:r>
-              <w:rPr>
-                <w:b/>
-                <w:color w:val="FFFFFF"/>
-                <w:sz w:val="18"/>
-              </w:rPr>
-              <w:t>Category</w:t>
-            </w:r>
-          </w:p>
-        </w:tc>
-        <w:tc>
-          <w:tcPr>
-            <w:tcW w:type="dxa" w:w="1662"/>
-            <w:shd w:fill="094D78" w:val="clear"/>
-          </w:tcPr>
-          <w:p>
-            <w:r/>
-            <w:r>
-              <w:rPr>
-                <w:b/>
-                <w:color w:val="FFFFFF"/>
-                <w:sz w:val="18"/>
-              </w:rPr>
-              <w:t>Comments</w:t>
-            </w:r>
-          </w:p>
-        </w:tc>
-      </w:tr>
-      <w:tr>
-        <w:tc>
-          <w:tcPr>
-            <w:tcW w:type="dxa" w:w="1662"/>
-          </w:tcPr>
-          <w:p>
-            <w:r/>
-            <w:r>
-              <w:rPr>
-                <w:b w:val="0"/>
-                <w:sz w:val="16"/>
-              </w:rPr>
-              <w:t>5</w:t>
-            </w:r>
-          </w:p>
-        </w:tc>
-        <w:tc>
-          <w:tcPr>
-            <w:tcW w:type="dxa" w:w="1662"/>
-          </w:tcPr>
-          <w:p>
-            <w:r/>
-            <w:r>
-              <w:rPr>
-                <w:b w:val="0"/>
-                <w:sz w:val="16"/>
-              </w:rPr>
-              <w:t>Instructions</w:t>
-            </w:r>
-          </w:p>
-        </w:tc>
-        <w:tc>
-          <w:tcPr>
-            <w:tcW w:type="dxa" w:w="1662"/>
-          </w:tcPr>
-          <w:p>
-            <w:r/>
-            <w:r>
-              <w:rPr>
-                <w:b w:val="0"/>
-                <w:sz w:val="16"/>
-              </w:rPr>
-              <w:t>düyməsini klikləyin</w:t>
-            </w:r>
-          </w:p>
-        </w:tc>
-        <w:tc>
-          <w:tcPr>
-            <w:tcW w:type="dxa" w:w="1662"/>
-          </w:tcPr>
-          <w:p>
-            <w:r/>
-            <w:r>
-              <w:rPr>
-                <w:b w:val="0"/>
-                <w:sz w:val="16"/>
-              </w:rPr>
-              <w:t>düyməsinə basın</w:t>
-            </w:r>
-          </w:p>
-        </w:tc>
-        <w:tc>
-          <w:tcPr>
-            <w:tcW w:type="dxa" w:w="1662"/>
-          </w:tcPr>
-          <w:p>
-            <w:r/>
-            <w:r>
-              <w:rPr>
-                <w:b w:val="0"/>
-                <w:sz w:val="16"/>
-              </w:rPr>
-              <w:t>Style</w:t>
-            </w:r>
-          </w:p>
-        </w:tc>
-        <w:tc>
-          <w:tcPr>
-            <w:tcW w:type="dxa" w:w="1662"/>
-          </w:tcPr>
-          <w:p>
-            <w:r/>
-            <w:r>
-              <w:rPr>
-                <w:b w:val="0"/>
-                <w:sz w:val="16"/>
-              </w:rPr>
-              <w:t>Anglicism; standard AZ interface copy uses basın.</w:t>
-            </w:r>
-          </w:p>
-        </w:tc>
-      </w:tr>
-    </w:tbl>
-    <w:p/>
-    <w:p>
       <w:r>
         <w:br w:type="page"/>
       </w:r>
@@ -1752,7 +970,7 @@
                 <w:b w:val="0"/>
                 <w:sz w:val="16"/>
               </w:rPr>
-              <w:t>6</w:t>
+              <w:t>2</w:t>
             </w:r>
           </w:p>
         </w:tc>
@@ -1833,1148 +1051,6 @@
                 <w:sz w:val="16"/>
               </w:rPr>
               <w:t>Harmonise navigation, cards, signatures, and i18n/ui.json.</w:t>
-            </w:r>
-          </w:p>
-        </w:tc>
-      </w:tr>
-    </w:tbl>
-    <w:p/>
-    <w:p>
-      <w:pPr>
-        <w:pStyle w:val="Heading2"/>
-      </w:pPr>
-      <w:r>
-        <w:t>en/application.html</w:t>
-      </w:r>
-    </w:p>
-    <w:p>
-      <w:r>
-        <w:t>Findings: 1</w:t>
-      </w:r>
-    </w:p>
-    <w:tbl>
-      <w:tblPr>
-        <w:tblStyle w:val="TableGrid"/>
-        <w:tblW w:type="auto" w:w="0"/>
-        <w:jc w:val="center"/>
-        <w:tblLook w:firstColumn="1" w:firstRow="1" w:lastColumn="0" w:lastRow="0" w:noHBand="0" w:noVBand="1" w:val="04A0"/>
-      </w:tblPr>
-      <w:tblGrid>
-        <w:gridCol w:w="1662"/>
-        <w:gridCol w:w="1662"/>
-        <w:gridCol w:w="1662"/>
-        <w:gridCol w:w="1662"/>
-        <w:gridCol w:w="1662"/>
-        <w:gridCol w:w="1662"/>
-      </w:tblGrid>
-      <w:tr>
-        <w:tc>
-          <w:tcPr>
-            <w:tcW w:type="dxa" w:w="1662"/>
-            <w:shd w:fill="094D78" w:val="clear"/>
-          </w:tcPr>
-          <w:p>
-            <w:r/>
-            <w:r>
-              <w:rPr>
-                <w:b/>
-                <w:color w:val="FFFFFF"/>
-                <w:sz w:val="18"/>
-              </w:rPr>
-              <w:t>#</w:t>
-            </w:r>
-          </w:p>
-        </w:tc>
-        <w:tc>
-          <w:tcPr>
-            <w:tcW w:type="dxa" w:w="1662"/>
-            <w:shd w:fill="094D78" w:val="clear"/>
-          </w:tcPr>
-          <w:p>
-            <w:r/>
-            <w:r>
-              <w:rPr>
-                <w:b/>
-                <w:color w:val="FFFFFF"/>
-                <w:sz w:val="18"/>
-              </w:rPr>
-              <w:t>Location</w:t>
-            </w:r>
-          </w:p>
-        </w:tc>
-        <w:tc>
-          <w:tcPr>
-            <w:tcW w:type="dxa" w:w="1662"/>
-            <w:shd w:fill="094D78" w:val="clear"/>
-          </w:tcPr>
-          <w:p>
-            <w:r/>
-            <w:r>
-              <w:rPr>
-                <w:b/>
-                <w:color w:val="FFFFFF"/>
-                <w:sz w:val="18"/>
-              </w:rPr>
-              <w:t>Original text</w:t>
-            </w:r>
-          </w:p>
-        </w:tc>
-        <w:tc>
-          <w:tcPr>
-            <w:tcW w:type="dxa" w:w="1662"/>
-            <w:shd w:fill="094D78" w:val="clear"/>
-          </w:tcPr>
-          <w:p>
-            <w:r/>
-            <w:r>
-              <w:rPr>
-                <w:b/>
-                <w:color w:val="FFFFFF"/>
-                <w:sz w:val="18"/>
-              </w:rPr>
-              <w:t>Recommended correction</w:t>
-            </w:r>
-          </w:p>
-        </w:tc>
-        <w:tc>
-          <w:tcPr>
-            <w:tcW w:type="dxa" w:w="1662"/>
-            <w:shd w:fill="094D78" w:val="clear"/>
-          </w:tcPr>
-          <w:p>
-            <w:r/>
-            <w:r>
-              <w:rPr>
-                <w:b/>
-                <w:color w:val="FFFFFF"/>
-                <w:sz w:val="18"/>
-              </w:rPr>
-              <w:t>Category</w:t>
-            </w:r>
-          </w:p>
-        </w:tc>
-        <w:tc>
-          <w:tcPr>
-            <w:tcW w:type="dxa" w:w="1662"/>
-            <w:shd w:fill="094D78" w:val="clear"/>
-          </w:tcPr>
-          <w:p>
-            <w:r/>
-            <w:r>
-              <w:rPr>
-                <w:b/>
-                <w:color w:val="FFFFFF"/>
-                <w:sz w:val="18"/>
-              </w:rPr>
-              <w:t>Comments</w:t>
-            </w:r>
-          </w:p>
-        </w:tc>
-      </w:tr>
-      <w:tr>
-        <w:tc>
-          <w:tcPr>
-            <w:tcW w:type="dxa" w:w="1662"/>
-          </w:tcPr>
-          <w:p>
-            <w:r/>
-            <w:r>
-              <w:rPr>
-                <w:b w:val="0"/>
-                <w:sz w:val="16"/>
-              </w:rPr>
-              <w:t>7</w:t>
-            </w:r>
-          </w:p>
-        </w:tc>
-        <w:tc>
-          <w:tcPr>
-            <w:tcW w:type="dxa" w:w="1662"/>
-          </w:tcPr>
-          <w:p>
-            <w:r/>
-            <w:r>
-              <w:rPr>
-                <w:b w:val="0"/>
-                <w:sz w:val="16"/>
-              </w:rPr>
-              <w:t>Degree option</w:t>
-            </w:r>
-          </w:p>
-        </w:tc>
-        <w:tc>
-          <w:tcPr>
-            <w:tcW w:type="dxa" w:w="1662"/>
-          </w:tcPr>
-          <w:p>
-            <w:r/>
-            <w:r>
-              <w:rPr>
-                <w:b w:val="0"/>
-                <w:sz w:val="16"/>
-              </w:rPr>
-              <w:t>PhD (Doctor of Philosophy) — Doctor of Sciences in Philosophy</w:t>
-            </w:r>
-          </w:p>
-        </w:tc>
-        <w:tc>
-          <w:tcPr>
-            <w:tcW w:type="dxa" w:w="1662"/>
-          </w:tcPr>
-          <w:p>
-            <w:r/>
-            <w:r>
-              <w:rPr>
-                <w:b w:val="0"/>
-                <w:sz w:val="16"/>
-              </w:rPr>
-              <w:t>PhD (Doctor of Philosophy)</w:t>
-            </w:r>
-          </w:p>
-        </w:tc>
-        <w:tc>
-          <w:tcPr>
-            <w:tcW w:type="dxa" w:w="1662"/>
-          </w:tcPr>
-          <w:p>
-            <w:r/>
-            <w:r>
-              <w:rPr>
-                <w:b w:val="0"/>
-                <w:sz w:val="16"/>
-              </w:rPr>
-              <w:t>Translation</w:t>
-            </w:r>
-          </w:p>
-        </w:tc>
-        <w:tc>
-          <w:tcPr>
-            <w:tcW w:type="dxa" w:w="1662"/>
-          </w:tcPr>
-          <w:p>
-            <w:r/>
-            <w:r>
-              <w:rPr>
-                <w:b w:val="0"/>
-                <w:sz w:val="16"/>
-              </w:rPr>
-              <w:t>Mistranslation of AZ 'Elmlər üzrə Fəlsəfə Doktoru'; not equivalent to Russian-style DSs.</w:t>
-            </w:r>
-          </w:p>
-        </w:tc>
-      </w:tr>
-    </w:tbl>
-    <w:p/>
-    <w:p>
-      <w:pPr>
-        <w:pStyle w:val="Heading2"/>
-      </w:pPr>
-      <w:r>
-        <w:t>en/index.html</w:t>
-      </w:r>
-    </w:p>
-    <w:p>
-      <w:r>
-        <w:t>Findings: 1</w:t>
-      </w:r>
-    </w:p>
-    <w:tbl>
-      <w:tblPr>
-        <w:tblStyle w:val="TableGrid"/>
-        <w:tblW w:type="auto" w:w="0"/>
-        <w:jc w:val="center"/>
-        <w:tblLook w:firstColumn="1" w:firstRow="1" w:lastColumn="0" w:lastRow="0" w:noHBand="0" w:noVBand="1" w:val="04A0"/>
-      </w:tblPr>
-      <w:tblGrid>
-        <w:gridCol w:w="1662"/>
-        <w:gridCol w:w="1662"/>
-        <w:gridCol w:w="1662"/>
-        <w:gridCol w:w="1662"/>
-        <w:gridCol w:w="1662"/>
-        <w:gridCol w:w="1662"/>
-      </w:tblGrid>
-      <w:tr>
-        <w:tc>
-          <w:tcPr>
-            <w:tcW w:type="dxa" w:w="1662"/>
-            <w:shd w:fill="094D78" w:val="clear"/>
-          </w:tcPr>
-          <w:p>
-            <w:r/>
-            <w:r>
-              <w:rPr>
-                <w:b/>
-                <w:color w:val="FFFFFF"/>
-                <w:sz w:val="18"/>
-              </w:rPr>
-              <w:t>#</w:t>
-            </w:r>
-          </w:p>
-        </w:tc>
-        <w:tc>
-          <w:tcPr>
-            <w:tcW w:type="dxa" w:w="1662"/>
-            <w:shd w:fill="094D78" w:val="clear"/>
-          </w:tcPr>
-          <w:p>
-            <w:r/>
-            <w:r>
-              <w:rPr>
-                <w:b/>
-                <w:color w:val="FFFFFF"/>
-                <w:sz w:val="18"/>
-              </w:rPr>
-              <w:t>Location</w:t>
-            </w:r>
-          </w:p>
-        </w:tc>
-        <w:tc>
-          <w:tcPr>
-            <w:tcW w:type="dxa" w:w="1662"/>
-            <w:shd w:fill="094D78" w:val="clear"/>
-          </w:tcPr>
-          <w:p>
-            <w:r/>
-            <w:r>
-              <w:rPr>
-                <w:b/>
-                <w:color w:val="FFFFFF"/>
-                <w:sz w:val="18"/>
-              </w:rPr>
-              <w:t>Original text</w:t>
-            </w:r>
-          </w:p>
-        </w:tc>
-        <w:tc>
-          <w:tcPr>
-            <w:tcW w:type="dxa" w:w="1662"/>
-            <w:shd w:fill="094D78" w:val="clear"/>
-          </w:tcPr>
-          <w:p>
-            <w:r/>
-            <w:r>
-              <w:rPr>
-                <w:b/>
-                <w:color w:val="FFFFFF"/>
-                <w:sz w:val="18"/>
-              </w:rPr>
-              <w:t>Recommended correction</w:t>
-            </w:r>
-          </w:p>
-        </w:tc>
-        <w:tc>
-          <w:tcPr>
-            <w:tcW w:type="dxa" w:w="1662"/>
-            <w:shd w:fill="094D78" w:val="clear"/>
-          </w:tcPr>
-          <w:p>
-            <w:r/>
-            <w:r>
-              <w:rPr>
-                <w:b/>
-                <w:color w:val="FFFFFF"/>
-                <w:sz w:val="18"/>
-              </w:rPr>
-              <w:t>Category</w:t>
-            </w:r>
-          </w:p>
-        </w:tc>
-        <w:tc>
-          <w:tcPr>
-            <w:tcW w:type="dxa" w:w="1662"/>
-            <w:shd w:fill="094D78" w:val="clear"/>
-          </w:tcPr>
-          <w:p>
-            <w:r/>
-            <w:r>
-              <w:rPr>
-                <w:b/>
-                <w:color w:val="FFFFFF"/>
-                <w:sz w:val="18"/>
-              </w:rPr>
-              <w:t>Comments</w:t>
-            </w:r>
-          </w:p>
-        </w:tc>
-      </w:tr>
-      <w:tr>
-        <w:tc>
-          <w:tcPr>
-            <w:tcW w:type="dxa" w:w="1662"/>
-            <w:shd w:fill="F4F7FA" w:val="clear"/>
-          </w:tcPr>
-          <w:p>
-            <w:r/>
-            <w:r>
-              <w:rPr>
-                <w:b w:val="0"/>
-                <w:sz w:val="16"/>
-              </w:rPr>
-              <w:t>8</w:t>
-            </w:r>
-          </w:p>
-        </w:tc>
-        <w:tc>
-          <w:tcPr>
-            <w:tcW w:type="dxa" w:w="1662"/>
-            <w:shd w:fill="F4F7FA" w:val="clear"/>
-          </w:tcPr>
-          <w:p>
-            <w:r/>
-            <w:r>
-              <w:rPr>
-                <w:b w:val="0"/>
-                <w:sz w:val="16"/>
-              </w:rPr>
-              <w:t>Hero CTA</w:t>
-            </w:r>
-          </w:p>
-        </w:tc>
-        <w:tc>
-          <w:tcPr>
-            <w:tcW w:type="dxa" w:w="1662"/>
-            <w:shd w:fill="F4F7FA" w:val="clear"/>
-          </w:tcPr>
-          <w:p>
-            <w:r/>
-            <w:r>
-              <w:rPr>
-                <w:b w:val="0"/>
-                <w:sz w:val="16"/>
-              </w:rPr>
-              <w:t>Join our Association</w:t>
-            </w:r>
-          </w:p>
-        </w:tc>
-        <w:tc>
-          <w:tcPr>
-            <w:tcW w:type="dxa" w:w="1662"/>
-            <w:shd w:fill="F4F7FA" w:val="clear"/>
-          </w:tcPr>
-          <w:p>
-            <w:r/>
-            <w:r>
-              <w:rPr>
-                <w:b w:val="0"/>
-                <w:sz w:val="16"/>
-              </w:rPr>
-              <w:t>View membership terms / Apply for membership</w:t>
-            </w:r>
-          </w:p>
-        </w:tc>
-        <w:tc>
-          <w:tcPr>
-            <w:tcW w:type="dxa" w:w="1662"/>
-            <w:shd w:fill="F4F7FA" w:val="clear"/>
-          </w:tcPr>
-          <w:p>
-            <w:r/>
-            <w:r>
-              <w:rPr>
-                <w:b w:val="0"/>
-                <w:sz w:val="16"/>
-              </w:rPr>
-              <w:t>UI wording</w:t>
-            </w:r>
-          </w:p>
-        </w:tc>
-        <w:tc>
-          <w:tcPr>
-            <w:tcW w:type="dxa" w:w="1662"/>
-            <w:shd w:fill="F4F7FA" w:val="clear"/>
-          </w:tcPr>
-          <w:p>
-            <w:r/>
-            <w:r>
-              <w:rPr>
-                <w:b w:val="0"/>
-                <w:sz w:val="16"/>
-              </w:rPr>
-              <w:t>CTA links to membership terms page, not application; AZ hero has same pattern.</w:t>
-            </w:r>
-          </w:p>
-        </w:tc>
-      </w:tr>
-    </w:tbl>
-    <w:p/>
-    <w:p>
-      <w:pPr>
-        <w:pStyle w:val="Heading2"/>
-      </w:pPr>
-      <w:r>
-        <w:t>en/membership.html</w:t>
-      </w:r>
-    </w:p>
-    <w:p>
-      <w:r>
-        <w:t>Findings: 1</w:t>
-      </w:r>
-    </w:p>
-    <w:tbl>
-      <w:tblPr>
-        <w:tblStyle w:val="TableGrid"/>
-        <w:tblW w:type="auto" w:w="0"/>
-        <w:jc w:val="center"/>
-        <w:tblLook w:firstColumn="1" w:firstRow="1" w:lastColumn="0" w:lastRow="0" w:noHBand="0" w:noVBand="1" w:val="04A0"/>
-      </w:tblPr>
-      <w:tblGrid>
-        <w:gridCol w:w="1662"/>
-        <w:gridCol w:w="1662"/>
-        <w:gridCol w:w="1662"/>
-        <w:gridCol w:w="1662"/>
-        <w:gridCol w:w="1662"/>
-        <w:gridCol w:w="1662"/>
-      </w:tblGrid>
-      <w:tr>
-        <w:tc>
-          <w:tcPr>
-            <w:tcW w:type="dxa" w:w="1662"/>
-            <w:shd w:fill="094D78" w:val="clear"/>
-          </w:tcPr>
-          <w:p>
-            <w:r/>
-            <w:r>
-              <w:rPr>
-                <w:b/>
-                <w:color w:val="FFFFFF"/>
-                <w:sz w:val="18"/>
-              </w:rPr>
-              <w:t>#</w:t>
-            </w:r>
-          </w:p>
-        </w:tc>
-        <w:tc>
-          <w:tcPr>
-            <w:tcW w:type="dxa" w:w="1662"/>
-            <w:shd w:fill="094D78" w:val="clear"/>
-          </w:tcPr>
-          <w:p>
-            <w:r/>
-            <w:r>
-              <w:rPr>
-                <w:b/>
-                <w:color w:val="FFFFFF"/>
-                <w:sz w:val="18"/>
-              </w:rPr>
-              <w:t>Location</w:t>
-            </w:r>
-          </w:p>
-        </w:tc>
-        <w:tc>
-          <w:tcPr>
-            <w:tcW w:type="dxa" w:w="1662"/>
-            <w:shd w:fill="094D78" w:val="clear"/>
-          </w:tcPr>
-          <w:p>
-            <w:r/>
-            <w:r>
-              <w:rPr>
-                <w:b/>
-                <w:color w:val="FFFFFF"/>
-                <w:sz w:val="18"/>
-              </w:rPr>
-              <w:t>Original text</w:t>
-            </w:r>
-          </w:p>
-        </w:tc>
-        <w:tc>
-          <w:tcPr>
-            <w:tcW w:type="dxa" w:w="1662"/>
-            <w:shd w:fill="094D78" w:val="clear"/>
-          </w:tcPr>
-          <w:p>
-            <w:r/>
-            <w:r>
-              <w:rPr>
-                <w:b/>
-                <w:color w:val="FFFFFF"/>
-                <w:sz w:val="18"/>
-              </w:rPr>
-              <w:t>Recommended correction</w:t>
-            </w:r>
-          </w:p>
-        </w:tc>
-        <w:tc>
-          <w:tcPr>
-            <w:tcW w:type="dxa" w:w="1662"/>
-            <w:shd w:fill="094D78" w:val="clear"/>
-          </w:tcPr>
-          <w:p>
-            <w:r/>
-            <w:r>
-              <w:rPr>
-                <w:b/>
-                <w:color w:val="FFFFFF"/>
-                <w:sz w:val="18"/>
-              </w:rPr>
-              <w:t>Category</w:t>
-            </w:r>
-          </w:p>
-        </w:tc>
-        <w:tc>
-          <w:tcPr>
-            <w:tcW w:type="dxa" w:w="1662"/>
-            <w:shd w:fill="094D78" w:val="clear"/>
-          </w:tcPr>
-          <w:p>
-            <w:r/>
-            <w:r>
-              <w:rPr>
-                <w:b/>
-                <w:color w:val="FFFFFF"/>
-                <w:sz w:val="18"/>
-              </w:rPr>
-              <w:t>Comments</w:t>
-            </w:r>
-          </w:p>
-        </w:tc>
-      </w:tr>
-      <w:tr>
-        <w:tc>
-          <w:tcPr>
-            <w:tcW w:type="dxa" w:w="1662"/>
-          </w:tcPr>
-          <w:p>
-            <w:r/>
-            <w:r>
-              <w:rPr>
-                <w:b w:val="0"/>
-                <w:sz w:val="16"/>
-              </w:rPr>
-              <w:t>9</w:t>
-            </w:r>
-          </w:p>
-        </w:tc>
-        <w:tc>
-          <w:tcPr>
-            <w:tcW w:type="dxa" w:w="1662"/>
-          </w:tcPr>
-          <w:p>
-            <w:r/>
-            <w:r>
-              <w:rPr>
-                <w:b w:val="0"/>
-                <w:sz w:val="16"/>
-              </w:rPr>
-              <w:t>Body instruction</w:t>
-            </w:r>
-          </w:p>
-        </w:tc>
-        <w:tc>
-          <w:tcPr>
-            <w:tcW w:type="dxa" w:w="1662"/>
-          </w:tcPr>
-          <w:p>
-            <w:r/>
-            <w:r>
-              <w:rPr>
-                <w:b w:val="0"/>
-                <w:sz w:val="16"/>
-              </w:rPr>
-              <w:t>click the "Join our Association" button</w:t>
-            </w:r>
-          </w:p>
-        </w:tc>
-        <w:tc>
-          <w:tcPr>
-            <w:tcW w:type="dxa" w:w="1662"/>
-          </w:tcPr>
-          <w:p>
-            <w:r/>
-            <w:r>
-              <w:rPr>
-                <w:b w:val="0"/>
-                <w:sz w:val="16"/>
-              </w:rPr>
-              <w:t>Use CTA label that exists on this page</w:t>
-            </w:r>
-          </w:p>
-        </w:tc>
-        <w:tc>
-          <w:tcPr>
-            <w:tcW w:type="dxa" w:w="1662"/>
-          </w:tcPr>
-          <w:p>
-            <w:r/>
-            <w:r>
-              <w:rPr>
-                <w:b w:val="0"/>
-                <w:sz w:val="16"/>
-              </w:rPr>
-              <w:t>UI wording</w:t>
-            </w:r>
-          </w:p>
-        </w:tc>
-        <w:tc>
-          <w:tcPr>
-            <w:tcW w:type="dxa" w:w="1662"/>
-          </w:tcPr>
-          <w:p>
-            <w:r/>
-            <w:r>
-              <w:rPr>
-                <w:b w:val="0"/>
-                <w:sz w:val="16"/>
-              </w:rPr>
-              <w:t>Referenced button text does not match this page hero.</w:t>
-            </w:r>
-          </w:p>
-        </w:tc>
-      </w:tr>
-    </w:tbl>
-    <w:p/>
-    <w:p>
-      <w:pPr>
-        <w:pStyle w:val="Heading2"/>
-      </w:pPr>
-      <w:r>
-        <w:t>en/scientists/list.html</w:t>
-      </w:r>
-    </w:p>
-    <w:p>
-      <w:r>
-        <w:t>Findings: 1</w:t>
-      </w:r>
-    </w:p>
-    <w:tbl>
-      <w:tblPr>
-        <w:tblStyle w:val="TableGrid"/>
-        <w:tblW w:type="auto" w:w="0"/>
-        <w:jc w:val="center"/>
-        <w:tblLook w:firstColumn="1" w:firstRow="1" w:lastColumn="0" w:lastRow="0" w:noHBand="0" w:noVBand="1" w:val="04A0"/>
-      </w:tblPr>
-      <w:tblGrid>
-        <w:gridCol w:w="1662"/>
-        <w:gridCol w:w="1662"/>
-        <w:gridCol w:w="1662"/>
-        <w:gridCol w:w="1662"/>
-        <w:gridCol w:w="1662"/>
-        <w:gridCol w:w="1662"/>
-      </w:tblGrid>
-      <w:tr>
-        <w:tc>
-          <w:tcPr>
-            <w:tcW w:type="dxa" w:w="1662"/>
-            <w:shd w:fill="094D78" w:val="clear"/>
-          </w:tcPr>
-          <w:p>
-            <w:r/>
-            <w:r>
-              <w:rPr>
-                <w:b/>
-                <w:color w:val="FFFFFF"/>
-                <w:sz w:val="18"/>
-              </w:rPr>
-              <w:t>#</w:t>
-            </w:r>
-          </w:p>
-        </w:tc>
-        <w:tc>
-          <w:tcPr>
-            <w:tcW w:type="dxa" w:w="1662"/>
-            <w:shd w:fill="094D78" w:val="clear"/>
-          </w:tcPr>
-          <w:p>
-            <w:r/>
-            <w:r>
-              <w:rPr>
-                <w:b/>
-                <w:color w:val="FFFFFF"/>
-                <w:sz w:val="18"/>
-              </w:rPr>
-              <w:t>Location</w:t>
-            </w:r>
-          </w:p>
-        </w:tc>
-        <w:tc>
-          <w:tcPr>
-            <w:tcW w:type="dxa" w:w="1662"/>
-            <w:shd w:fill="094D78" w:val="clear"/>
-          </w:tcPr>
-          <w:p>
-            <w:r/>
-            <w:r>
-              <w:rPr>
-                <w:b/>
-                <w:color w:val="FFFFFF"/>
-                <w:sz w:val="18"/>
-              </w:rPr>
-              <w:t>Original text</w:t>
-            </w:r>
-          </w:p>
-        </w:tc>
-        <w:tc>
-          <w:tcPr>
-            <w:tcW w:type="dxa" w:w="1662"/>
-            <w:shd w:fill="094D78" w:val="clear"/>
-          </w:tcPr>
-          <w:p>
-            <w:r/>
-            <w:r>
-              <w:rPr>
-                <w:b/>
-                <w:color w:val="FFFFFF"/>
-                <w:sz w:val="18"/>
-              </w:rPr>
-              <w:t>Recommended correction</w:t>
-            </w:r>
-          </w:p>
-        </w:tc>
-        <w:tc>
-          <w:tcPr>
-            <w:tcW w:type="dxa" w:w="1662"/>
-            <w:shd w:fill="094D78" w:val="clear"/>
-          </w:tcPr>
-          <w:p>
-            <w:r/>
-            <w:r>
-              <w:rPr>
-                <w:b/>
-                <w:color w:val="FFFFFF"/>
-                <w:sz w:val="18"/>
-              </w:rPr>
-              <w:t>Category</w:t>
-            </w:r>
-          </w:p>
-        </w:tc>
-        <w:tc>
-          <w:tcPr>
-            <w:tcW w:type="dxa" w:w="1662"/>
-            <w:shd w:fill="094D78" w:val="clear"/>
-          </w:tcPr>
-          <w:p>
-            <w:r/>
-            <w:r>
-              <w:rPr>
-                <w:b/>
-                <w:color w:val="FFFFFF"/>
-                <w:sz w:val="18"/>
-              </w:rPr>
-              <w:t>Comments</w:t>
-            </w:r>
-          </w:p>
-        </w:tc>
-      </w:tr>
-      <w:tr>
-        <w:tc>
-          <w:tcPr>
-            <w:tcW w:type="dxa" w:w="1662"/>
-            <w:shd w:fill="F4F7FA" w:val="clear"/>
-          </w:tcPr>
-          <w:p>
-            <w:r/>
-            <w:r>
-              <w:rPr>
-                <w:b w:val="0"/>
-                <w:sz w:val="16"/>
-              </w:rPr>
-              <w:t>10</w:t>
-            </w:r>
-          </w:p>
-        </w:tc>
-        <w:tc>
-          <w:tcPr>
-            <w:tcW w:type="dxa" w:w="1662"/>
-            <w:shd w:fill="F4F7FA" w:val="clear"/>
-          </w:tcPr>
-          <w:p>
-            <w:r/>
-            <w:r>
-              <w:rPr>
-                <w:b w:val="0"/>
-                <w:sz w:val="16"/>
-              </w:rPr>
-              <w:t>Filter vs column</w:t>
-            </w:r>
-          </w:p>
-        </w:tc>
-        <w:tc>
-          <w:tcPr>
-            <w:tcW w:type="dxa" w:w="1662"/>
-            <w:shd w:fill="F4F7FA" w:val="clear"/>
-          </w:tcPr>
-          <w:p>
-            <w:r/>
-            <w:r>
-              <w:rPr>
-                <w:b w:val="0"/>
-                <w:sz w:val="16"/>
-              </w:rPr>
-              <w:t>Degree</w:t>
-            </w:r>
-          </w:p>
-        </w:tc>
-        <w:tc>
-          <w:tcPr>
-            <w:tcW w:type="dxa" w:w="1662"/>
-            <w:shd w:fill="F4F7FA" w:val="clear"/>
-          </w:tcPr>
-          <w:p>
-            <w:r/>
-            <w:r>
-              <w:rPr>
-                <w:b w:val="0"/>
-                <w:sz w:val="16"/>
-              </w:rPr>
-              <w:t>Academic degree</w:t>
-            </w:r>
-          </w:p>
-        </w:tc>
-        <w:tc>
-          <w:tcPr>
-            <w:tcW w:type="dxa" w:w="1662"/>
-            <w:shd w:fill="F4F7FA" w:val="clear"/>
-          </w:tcPr>
-          <w:p>
-            <w:r/>
-            <w:r>
-              <w:rPr>
-                <w:b w:val="0"/>
-                <w:sz w:val="16"/>
-              </w:rPr>
-              <w:t>UI wording</w:t>
-            </w:r>
-          </w:p>
-        </w:tc>
-        <w:tc>
-          <w:tcPr>
-            <w:tcW w:type="dxa" w:w="1662"/>
-            <w:shd w:fill="F4F7FA" w:val="clear"/>
-          </w:tcPr>
-          <w:p>
-            <w:r/>
-            <w:r>
-              <w:rPr>
-                <w:b w:val="0"/>
-                <w:sz w:val="16"/>
-              </w:rPr>
-              <w:t>AZ filter uses 'Elmi dərəcə'; column header is longer.</w:t>
-            </w:r>
-          </w:p>
-        </w:tc>
-      </w:tr>
-    </w:tbl>
-    <w:p/>
-    <w:p>
-      <w:pPr>
-        <w:pStyle w:val="Heading2"/>
-      </w:pPr>
-      <w:r>
-        <w:t>en/sponsors.html</w:t>
-      </w:r>
-    </w:p>
-    <w:p>
-      <w:r>
-        <w:t>Findings: 1</w:t>
-      </w:r>
-    </w:p>
-    <w:tbl>
-      <w:tblPr>
-        <w:tblStyle w:val="TableGrid"/>
-        <w:tblW w:type="auto" w:w="0"/>
-        <w:jc w:val="center"/>
-        <w:tblLook w:firstColumn="1" w:firstRow="1" w:lastColumn="0" w:lastRow="0" w:noHBand="0" w:noVBand="1" w:val="04A0"/>
-      </w:tblPr>
-      <w:tblGrid>
-        <w:gridCol w:w="1662"/>
-        <w:gridCol w:w="1662"/>
-        <w:gridCol w:w="1662"/>
-        <w:gridCol w:w="1662"/>
-        <w:gridCol w:w="1662"/>
-        <w:gridCol w:w="1662"/>
-      </w:tblGrid>
-      <w:tr>
-        <w:tc>
-          <w:tcPr>
-            <w:tcW w:type="dxa" w:w="1662"/>
-            <w:shd w:fill="094D78" w:val="clear"/>
-          </w:tcPr>
-          <w:p>
-            <w:r/>
-            <w:r>
-              <w:rPr>
-                <w:b/>
-                <w:color w:val="FFFFFF"/>
-                <w:sz w:val="18"/>
-              </w:rPr>
-              <w:t>#</w:t>
-            </w:r>
-          </w:p>
-        </w:tc>
-        <w:tc>
-          <w:tcPr>
-            <w:tcW w:type="dxa" w:w="1662"/>
-            <w:shd w:fill="094D78" w:val="clear"/>
-          </w:tcPr>
-          <w:p>
-            <w:r/>
-            <w:r>
-              <w:rPr>
-                <w:b/>
-                <w:color w:val="FFFFFF"/>
-                <w:sz w:val="18"/>
-              </w:rPr>
-              <w:t>Location</w:t>
-            </w:r>
-          </w:p>
-        </w:tc>
-        <w:tc>
-          <w:tcPr>
-            <w:tcW w:type="dxa" w:w="1662"/>
-            <w:shd w:fill="094D78" w:val="clear"/>
-          </w:tcPr>
-          <w:p>
-            <w:r/>
-            <w:r>
-              <w:rPr>
-                <w:b/>
-                <w:color w:val="FFFFFF"/>
-                <w:sz w:val="18"/>
-              </w:rPr>
-              <w:t>Original text</w:t>
-            </w:r>
-          </w:p>
-        </w:tc>
-        <w:tc>
-          <w:tcPr>
-            <w:tcW w:type="dxa" w:w="1662"/>
-            <w:shd w:fill="094D78" w:val="clear"/>
-          </w:tcPr>
-          <w:p>
-            <w:r/>
-            <w:r>
-              <w:rPr>
-                <w:b/>
-                <w:color w:val="FFFFFF"/>
-                <w:sz w:val="18"/>
-              </w:rPr>
-              <w:t>Recommended correction</w:t>
-            </w:r>
-          </w:p>
-        </w:tc>
-        <w:tc>
-          <w:tcPr>
-            <w:tcW w:type="dxa" w:w="1662"/>
-            <w:shd w:fill="094D78" w:val="clear"/>
-          </w:tcPr>
-          <w:p>
-            <w:r/>
-            <w:r>
-              <w:rPr>
-                <w:b/>
-                <w:color w:val="FFFFFF"/>
-                <w:sz w:val="18"/>
-              </w:rPr>
-              <w:t>Category</w:t>
-            </w:r>
-          </w:p>
-        </w:tc>
-        <w:tc>
-          <w:tcPr>
-            <w:tcW w:type="dxa" w:w="1662"/>
-            <w:shd w:fill="094D78" w:val="clear"/>
-          </w:tcPr>
-          <w:p>
-            <w:r/>
-            <w:r>
-              <w:rPr>
-                <w:b/>
-                <w:color w:val="FFFFFF"/>
-                <w:sz w:val="18"/>
-              </w:rPr>
-              <w:t>Comments</w:t>
-            </w:r>
-          </w:p>
-        </w:tc>
-      </w:tr>
-      <w:tr>
-        <w:tc>
-          <w:tcPr>
-            <w:tcW w:type="dxa" w:w="1662"/>
-          </w:tcPr>
-          <w:p>
-            <w:r/>
-            <w:r>
-              <w:rPr>
-                <w:b w:val="0"/>
-                <w:sz w:val="16"/>
-              </w:rPr>
-              <w:t>11</w:t>
-            </w:r>
-          </w:p>
-        </w:tc>
-        <w:tc>
-          <w:tcPr>
-            <w:tcW w:type="dxa" w:w="1662"/>
-          </w:tcPr>
-          <w:p>
-            <w:r/>
-            <w:r>
-              <w:rPr>
-                <w:b w:val="0"/>
-                <w:sz w:val="16"/>
-              </w:rPr>
-              <w:t>Meta description</w:t>
-            </w:r>
-          </w:p>
-        </w:tc>
-        <w:tc>
-          <w:tcPr>
-            <w:tcW w:type="dxa" w:w="1662"/>
-          </w:tcPr>
-          <w:p>
-            <w:r/>
-            <w:r>
-              <w:rPr>
-                <w:b w:val="0"/>
-                <w:sz w:val="16"/>
-              </w:rPr>
-              <w:t>Partner with WAAS through corporate sponsorship — scholarships, forums, and research collaboration.</w:t>
-            </w:r>
-          </w:p>
-        </w:tc>
-        <w:tc>
-          <w:tcPr>
-            <w:tcW w:type="dxa" w:w="1662"/>
-          </w:tcPr>
-          <w:p>
-            <w:r/>
-            <w:r>
-              <w:rPr>
-                <w:b w:val="0"/>
-                <w:sz w:val="16"/>
-              </w:rPr>
-              <w:t>Partner with WAAS through corporate sponsorship — scientistships, forums, and research collaboration.</w:t>
-            </w:r>
-          </w:p>
-        </w:tc>
-        <w:tc>
-          <w:tcPr>
-            <w:tcW w:type="dxa" w:w="1662"/>
-          </w:tcPr>
-          <w:p>
-            <w:r/>
-            <w:r>
-              <w:rPr>
-                <w:b w:val="0"/>
-                <w:sz w:val="16"/>
-              </w:rPr>
-              <w:t>Terminology</w:t>
-            </w:r>
-          </w:p>
-        </w:tc>
-        <w:tc>
-          <w:tcPr>
-            <w:tcW w:type="dxa" w:w="1662"/>
-          </w:tcPr>
-          <w:p>
-            <w:r/>
-            <w:r>
-              <w:rPr>
-                <w:b w:val="0"/>
-                <w:sz w:val="16"/>
-              </w:rPr>
-              <w:t>Meta uses 'scholars' while on-page copy uses 'scientists'.</w:t>
             </w:r>
           </w:p>
         </w:tc>
@@ -3130,7 +1206,6 @@
         <w:tc>
           <w:tcPr>
             <w:tcW w:type="dxa" w:w="1662"/>
-            <w:shd w:fill="F4F7FA" w:val="clear"/>
           </w:tcPr>
           <w:p>
             <w:r/>
@@ -3139,14 +1214,13 @@
                 <w:b w:val="0"/>
                 <w:sz w:val="16"/>
               </w:rPr>
-              <w:t>12</w:t>
+              <w:t>3</w:t>
             </w:r>
           </w:p>
         </w:tc>
         <w:tc>
           <w:tcPr>
             <w:tcW w:type="dxa" w:w="1662"/>
-            <w:shd w:fill="F4F7FA" w:val="clear"/>
           </w:tcPr>
           <w:p>
             <w:r/>
@@ -3162,7 +1236,6 @@
         <w:tc>
           <w:tcPr>
             <w:tcW w:type="dxa" w:w="1662"/>
-            <w:shd w:fill="F4F7FA" w:val="clear"/>
           </w:tcPr>
           <w:p>
             <w:r/>
@@ -3178,7 +1251,6 @@
         <w:tc>
           <w:tcPr>
             <w:tcW w:type="dxa" w:w="1662"/>
-            <w:shd w:fill="F4F7FA" w:val="clear"/>
           </w:tcPr>
           <w:p>
             <w:r/>
@@ -3194,7 +1266,6 @@
         <w:tc>
           <w:tcPr>
             <w:tcW w:type="dxa" w:w="1662"/>
-            <w:shd w:fill="F4F7FA" w:val="clear"/>
           </w:tcPr>
           <w:p>
             <w:r/>
@@ -3210,7 +1281,6 @@
         <w:tc>
           <w:tcPr>
             <w:tcW w:type="dxa" w:w="1662"/>
-            <w:shd w:fill="F4F7FA" w:val="clear"/>
           </w:tcPr>
           <w:p>
             <w:r/>
@@ -3228,6 +1298,7 @@
         <w:tc>
           <w:tcPr>
             <w:tcW w:type="dxa" w:w="1662"/>
+            <w:shd w:fill="F4F7FA" w:val="clear"/>
           </w:tcPr>
           <w:p>
             <w:r/>
@@ -3236,13 +1307,14 @@
                 <w:b w:val="0"/>
                 <w:sz w:val="16"/>
               </w:rPr>
-              <w:t>13</w:t>
+              <w:t>4</w:t>
             </w:r>
           </w:p>
         </w:tc>
         <w:tc>
           <w:tcPr>
             <w:tcW w:type="dxa" w:w="1662"/>
+            <w:shd w:fill="F4F7FA" w:val="clear"/>
           </w:tcPr>
           <w:p>
             <w:r/>
@@ -3258,6 +1330,7 @@
         <w:tc>
           <w:tcPr>
             <w:tcW w:type="dxa" w:w="1662"/>
+            <w:shd w:fill="F4F7FA" w:val="clear"/>
           </w:tcPr>
           <w:p>
             <w:r/>
@@ -3273,6 +1346,7 @@
         <w:tc>
           <w:tcPr>
             <w:tcW w:type="dxa" w:w="1662"/>
+            <w:shd w:fill="F4F7FA" w:val="clear"/>
           </w:tcPr>
           <w:p>
             <w:r/>
@@ -3288,6 +1362,7 @@
         <w:tc>
           <w:tcPr>
             <w:tcW w:type="dxa" w:w="1662"/>
+            <w:shd w:fill="F4F7FA" w:val="clear"/>
           </w:tcPr>
           <w:p>
             <w:r/>
@@ -3303,6 +1378,7 @@
         <w:tc>
           <w:tcPr>
             <w:tcW w:type="dxa" w:w="1662"/>
+            <w:shd w:fill="F4F7FA" w:val="clear"/>
           </w:tcPr>
           <w:p>
             <w:r/>
@@ -3552,14 +1628,6 @@
         <w:pStyle w:val="ListBullet"/>
       </w:pPr>
       <w:r>
-        <w:t>az/sponsors.html</w:t>
-      </w:r>
-    </w:p>
-    <w:p>
-      <w:pPr>
-        <w:pStyle w:val="ListBullet"/>
-      </w:pPr>
-      <w:r>
         <w:t>az/sponsors_flyer.html</w:t>
       </w:r>
     </w:p>
@@ -3793,14 +1861,6 @@
       </w:pPr>
       <w:r>
         <w:t>en/scientists/profiles.html</w:t>
-      </w:r>
-    </w:p>
-    <w:p>
-      <w:pPr>
-        <w:pStyle w:val="ListBullet"/>
-      </w:pPr>
-      <w:r>
-        <w:t>en/sponsors.html</w:t>
       </w:r>
     </w:p>
     <w:p>

</xml_diff>